<commit_message>
Add gray-world WB + CLAHE baseline; drop original search from the deck; add PDF
- New baseline: gray-world white balance + CLAHE on L* (clip 2.0, 8x8),
  the common practitioner recipe, untuned. Hybrid vs. it on 622 held-out
  images: +0.34 dB PSNR (small), +0.033 SSIM (large). Existing results
  unchanged; app, report, README and code guide include it
- Deck: original UCIQE+UIQM search and its finding slide removed (17
  slides); contributions chart shows Modules 5 + 7 together; results
  title and takeaways derived from significance tests; axes fit the data
- docs/Review_II_Presentation.pdf exported from PowerPoint
- App: clear message when a running server holds stale pipeline code
- .gitignore: Office lock files

Co-Authored-By: Claude Opus 5.5 <noreply@anthropic.com>
</commit_message>
<xml_diff>
--- a/outputs/Review_II_Results_Section.docx
+++ b/outputs/Review_II_Results_Section.docx
@@ -439,6 +439,86 @@
               <w:rPr>
                 <w:sz w:val="18"/>
               </w:rPr>
+              <w:t>Gray-world WB + CLAHE (baseline)</w:t>
+            </w:r>
+          </w:p>
+        </w:tc>
+        <w:tc>
+          <w:tcPr>
+            <w:tcW w:type="dxa" w:w="1440"/>
+          </w:tcPr>
+          <w:p>
+            <w:r>
+              <w:rPr>
+                <w:sz w:val="18"/>
+              </w:rPr>
+              <w:t>7.313 ± 0.414</w:t>
+            </w:r>
+          </w:p>
+        </w:tc>
+        <w:tc>
+          <w:tcPr>
+            <w:tcW w:type="dxa" w:w="1440"/>
+          </w:tcPr>
+          <w:p>
+            <w:r>
+              <w:rPr>
+                <w:sz w:val="18"/>
+              </w:rPr>
+              <w:t>0.331 ± 0.069</w:t>
+            </w:r>
+          </w:p>
+        </w:tc>
+        <w:tc>
+          <w:tcPr>
+            <w:tcW w:type="dxa" w:w="1440"/>
+          </w:tcPr>
+          <w:p>
+            <w:r>
+              <w:rPr>
+                <w:sz w:val="18"/>
+              </w:rPr>
+              <w:t>2.297 ± 0.558</w:t>
+            </w:r>
+          </w:p>
+        </w:tc>
+        <w:tc>
+          <w:tcPr>
+            <w:tcW w:type="dxa" w:w="1440"/>
+          </w:tcPr>
+          <w:p>
+            <w:r>
+              <w:rPr>
+                <w:sz w:val="18"/>
+              </w:rPr>
+              <w:t>17.93 ± 3.42</w:t>
+            </w:r>
+          </w:p>
+        </w:tc>
+        <w:tc>
+          <w:tcPr>
+            <w:tcW w:type="dxa" w:w="1440"/>
+          </w:tcPr>
+          <w:p>
+            <w:r>
+              <w:rPr>
+                <w:sz w:val="18"/>
+              </w:rPr>
+              <w:t>0.838 ± 0.079</w:t>
+            </w:r>
+          </w:p>
+        </w:tc>
+      </w:tr>
+      <w:tr>
+        <w:tc>
+          <w:tcPr>
+            <w:tcW w:type="dxa" w:w="1440"/>
+          </w:tcPr>
+          <w:p>
+            <w:r>
+              <w:rPr>
+                <w:sz w:val="18"/>
+              </w:rPr>
               <w:t>Hybrid — neither module</w:t>
             </w:r>
           </w:p>
@@ -1002,7 +1082,7 @@
               <w:rPr>
                 <w:sz w:val="18"/>
               </w:rPr>
-              <w:t>3.0e-91 ***</w:t>
+              <w:t>3.5e-91 ***</w:t>
             </w:r>
           </w:p>
         </w:tc>
@@ -1069,7 +1149,7 @@
               <w:rPr>
                 <w:sz w:val="18"/>
               </w:rPr>
-              <w:t>5.6e-102 ***</w:t>
+              <w:t>6.4e-102 ***</w:t>
             </w:r>
           </w:p>
         </w:tc>
@@ -1136,7 +1216,7 @@
               <w:rPr>
                 <w:sz w:val="18"/>
               </w:rPr>
-              <w:t>2.8e-53 ***</w:t>
+              <w:t>3.3e-53 ***</w:t>
             </w:r>
           </w:p>
         </w:tc>
@@ -1203,7 +1283,7 @@
               <w:rPr>
                 <w:sz w:val="18"/>
               </w:rPr>
-              <w:t>1.8e-93 ***</w:t>
+              <w:t>2.1e-93 ***</w:t>
             </w:r>
           </w:p>
         </w:tc>
@@ -1270,7 +1350,7 @@
               <w:rPr>
                 <w:sz w:val="18"/>
               </w:rPr>
-              <w:t>2.5e-97 ***</w:t>
+              <w:t>2.9e-97 ***</w:t>
             </w:r>
           </w:p>
         </w:tc>
@@ -1285,7 +1365,7 @@
               <w:rPr>
                 <w:sz w:val="18"/>
               </w:rPr>
-              <w:t>Conventional HE (baseline)</w:t>
+              <w:t>Gray-world WB + CLAHE (baseline)</w:t>
             </w:r>
           </w:p>
         </w:tc>
@@ -1311,7 +1391,7 @@
               <w:rPr>
                 <w:sz w:val="18"/>
               </w:rPr>
-              <w:t>-0.607 [-0.629, -0.584]</w:t>
+              <w:t>-0.077 [-0.088, -0.066]</w:t>
             </w:r>
           </w:p>
         </w:tc>
@@ -1324,7 +1404,7 @@
               <w:rPr>
                 <w:sz w:val="18"/>
               </w:rPr>
-              <w:t>-1.00 (large)</w:t>
+              <w:t>-0.61 (large)</w:t>
             </w:r>
           </w:p>
         </w:tc>
@@ -1337,7 +1417,7 @@
               <w:rPr>
                 <w:sz w:val="18"/>
               </w:rPr>
-              <w:t>6.4e-102 ***</w:t>
+              <w:t>1.6e-38 ***</w:t>
             </w:r>
           </w:p>
         </w:tc>
@@ -1352,7 +1432,7 @@
               <w:rPr>
                 <w:sz w:val="18"/>
               </w:rPr>
-              <w:t>Conventional HE (baseline)</w:t>
+              <w:t>Gray-world WB + CLAHE (baseline)</w:t>
             </w:r>
           </w:p>
         </w:tc>
@@ -1378,7 +1458,7 @@
               <w:rPr>
                 <w:sz w:val="18"/>
               </w:rPr>
-              <w:t>-0.133 [-0.139, -0.128]</w:t>
+              <w:t>-0.019 [-0.021, -0.017]</w:t>
             </w:r>
           </w:p>
         </w:tc>
@@ -1391,7 +1471,7 @@
               <w:rPr>
                 <w:sz w:val="18"/>
               </w:rPr>
-              <w:t>-1.00 (large)</w:t>
+              <w:t>-0.64 (large)</w:t>
             </w:r>
           </w:p>
         </w:tc>
@@ -1404,7 +1484,7 @@
               <w:rPr>
                 <w:sz w:val="18"/>
               </w:rPr>
-              <w:t>5.6e-102 ***</w:t>
+              <w:t>2.1e-42 ***</w:t>
             </w:r>
           </w:p>
         </w:tc>
@@ -1419,7 +1499,7 @@
               <w:rPr>
                 <w:sz w:val="18"/>
               </w:rPr>
-              <w:t>Conventional HE (baseline)</w:t>
+              <w:t>Gray-world WB + CLAHE (baseline)</w:t>
             </w:r>
           </w:p>
         </w:tc>
@@ -1445,7 +1525,7 @@
               <w:rPr>
                 <w:sz w:val="18"/>
               </w:rPr>
-              <w:t>-0.400 [-0.429, -0.371]</w:t>
+              <w:t>-0.161 [-0.177, -0.145]</w:t>
             </w:r>
           </w:p>
         </w:tc>
@@ -1458,7 +1538,7 @@
               <w:rPr>
                 <w:sz w:val="18"/>
               </w:rPr>
-              <w:t>-0.91 (large)</w:t>
+              <w:t>-0.74 (large)</w:t>
             </w:r>
           </w:p>
         </w:tc>
@@ -1471,7 +1551,7 @@
               <w:rPr>
                 <w:sz w:val="18"/>
               </w:rPr>
-              <w:t>2.4e-84 ***</w:t>
+              <w:t>9.5e-57 ***</w:t>
             </w:r>
           </w:p>
         </w:tc>
@@ -1486,7 +1566,7 @@
               <w:rPr>
                 <w:sz w:val="18"/>
               </w:rPr>
-              <w:t>Conventional HE (baseline)</w:t>
+              <w:t>Gray-world WB + CLAHE (baseline)</w:t>
             </w:r>
           </w:p>
         </w:tc>
@@ -1512,7 +1592,7 @@
               <w:rPr>
                 <w:sz w:val="18"/>
               </w:rPr>
-              <w:t>+1.91 [+1.60, +2.22]</w:t>
+              <w:t>+0.34 [+0.17, +0.52]</w:t>
             </w:r>
           </w:p>
         </w:tc>
@@ -1525,7 +1605,7 @@
               <w:rPr>
                 <w:sz w:val="18"/>
               </w:rPr>
-              <w:t>+0.48 (medium)</w:t>
+              <w:t>+0.24 (small)</w:t>
             </w:r>
           </w:p>
         </w:tc>
@@ -1538,7 +1618,7 @@
               <w:rPr>
                 <w:sz w:val="18"/>
               </w:rPr>
-              <w:t>2.8e-24 ***</w:t>
+              <w:t>2.7e-06 ***</w:t>
             </w:r>
           </w:p>
         </w:tc>
@@ -1553,7 +1633,7 @@
               <w:rPr>
                 <w:sz w:val="18"/>
               </w:rPr>
-              <w:t>Conventional HE (baseline)</w:t>
+              <w:t>Gray-world WB + CLAHE (baseline)</w:t>
             </w:r>
           </w:p>
         </w:tc>
@@ -1579,7 +1659,7 @@
               <w:rPr>
                 <w:sz w:val="18"/>
               </w:rPr>
-              <w:t>+0.091 [+0.082, +0.099]</w:t>
+              <w:t>+0.033 [+0.029, +0.038]</w:t>
             </w:r>
           </w:p>
         </w:tc>
@@ -1592,7 +1672,7 @@
               <w:rPr>
                 <w:sz w:val="18"/>
               </w:rPr>
-              <w:t>+0.74 (large)</w:t>
+              <w:t>+0.59 (large)</w:t>
             </w:r>
           </w:p>
         </w:tc>
@@ -1605,7 +1685,7 @@
               <w:rPr>
                 <w:sz w:val="18"/>
               </w:rPr>
-              <w:t>1.3e-56 ***</w:t>
+              <w:t>1.2e-35 ***</w:t>
             </w:r>
           </w:p>
         </w:tc>
@@ -1620,7 +1700,7 @@
               <w:rPr>
                 <w:sz w:val="18"/>
               </w:rPr>
-              <w:t>CLAHE-only (baseline)</w:t>
+              <w:t>Conventional HE (baseline)</w:t>
             </w:r>
           </w:p>
         </w:tc>
@@ -1646,7 +1726,7 @@
               <w:rPr>
                 <w:sz w:val="18"/>
               </w:rPr>
-              <w:t>-0.069 [-0.080, -0.057]</w:t>
+              <w:t>-0.607 [-0.629, -0.584]</w:t>
             </w:r>
           </w:p>
         </w:tc>
@@ -1659,7 +1739,7 @@
               <w:rPr>
                 <w:sz w:val="18"/>
               </w:rPr>
-              <w:t>-0.55 (large)</w:t>
+              <w:t>-1.00 (large)</w:t>
             </w:r>
           </w:p>
         </w:tc>
@@ -1672,7 +1752,7 @@
               <w:rPr>
                 <w:sz w:val="18"/>
               </w:rPr>
-              <w:t>3.2e-31 ***</w:t>
+              <w:t>7.4e-102 ***</w:t>
             </w:r>
           </w:p>
         </w:tc>
@@ -1687,7 +1767,7 @@
               <w:rPr>
                 <w:sz w:val="18"/>
               </w:rPr>
-              <w:t>CLAHE-only (baseline)</w:t>
+              <w:t>Conventional HE (baseline)</w:t>
             </w:r>
           </w:p>
         </w:tc>
@@ -1713,7 +1793,7 @@
               <w:rPr>
                 <w:sz w:val="18"/>
               </w:rPr>
-              <w:t>-0.047 [-0.050, -0.044]</w:t>
+              <w:t>-0.133 [-0.139, -0.128]</w:t>
             </w:r>
           </w:p>
         </w:tc>
@@ -1726,7 +1806,7 @@
               <w:rPr>
                 <w:sz w:val="18"/>
               </w:rPr>
-              <w:t>-0.91 (large)</w:t>
+              <w:t>-1.00 (large)</w:t>
             </w:r>
           </w:p>
         </w:tc>
@@ -1739,7 +1819,7 @@
               <w:rPr>
                 <w:sz w:val="18"/>
               </w:rPr>
-              <w:t>5.8e-85 ***</w:t>
+              <w:t>6.4e-102 ***</w:t>
             </w:r>
           </w:p>
         </w:tc>
@@ -1754,7 +1834,7 @@
               <w:rPr>
                 <w:sz w:val="18"/>
               </w:rPr>
-              <w:t>CLAHE-only (baseline)</w:t>
+              <w:t>Conventional HE (baseline)</w:t>
             </w:r>
           </w:p>
         </w:tc>
@@ -1780,7 +1860,7 @@
               <w:rPr>
                 <w:sz w:val="18"/>
               </w:rPr>
-              <w:t>-0.038 [-0.051, -0.026]</w:t>
+              <w:t>-0.400 [-0.429, -0.371]</w:t>
             </w:r>
           </w:p>
         </w:tc>
@@ -1793,7 +1873,7 @@
               <w:rPr>
                 <w:sz w:val="18"/>
               </w:rPr>
-              <w:t>-0.28 (small)</w:t>
+              <w:t>-0.91 (large)</w:t>
             </w:r>
           </w:p>
         </w:tc>
@@ -1806,7 +1886,7 @@
               <w:rPr>
                 <w:sz w:val="18"/>
               </w:rPr>
-              <w:t>2.4e-08 ***</w:t>
+              <w:t>2.9e-84 ***</w:t>
             </w:r>
           </w:p>
         </w:tc>
@@ -1821,7 +1901,7 @@
               <w:rPr>
                 <w:sz w:val="18"/>
               </w:rPr>
-              <w:t>CLAHE-only (baseline)</w:t>
+              <w:t>Conventional HE (baseline)</w:t>
             </w:r>
           </w:p>
         </w:tc>
@@ -1847,7 +1927,7 @@
               <w:rPr>
                 <w:sz w:val="18"/>
               </w:rPr>
-              <w:t>-0.04 [-0.30, +0.20]</w:t>
+              <w:t>+1.91 [+1.60, +2.22]</w:t>
             </w:r>
           </w:p>
         </w:tc>
@@ -1860,7 +1940,7 @@
               <w:rPr>
                 <w:sz w:val="18"/>
               </w:rPr>
-              <w:t>+0.04 (negligible)</w:t>
+              <w:t>+0.48 (medium)</w:t>
             </w:r>
           </w:p>
         </w:tc>
@@ -1873,7 +1953,7 @@
               <w:rPr>
                 <w:sz w:val="18"/>
               </w:rPr>
-              <w:t>4.3e-01 ns</w:t>
+              <w:t>3.0e-24 ***</w:t>
             </w:r>
           </w:p>
         </w:tc>
@@ -1888,7 +1968,7 @@
               <w:rPr>
                 <w:sz w:val="18"/>
               </w:rPr>
-              <w:t>CLAHE-only (baseline)</w:t>
+              <w:t>Conventional HE (baseline)</w:t>
             </w:r>
           </w:p>
         </w:tc>
@@ -1914,7 +1994,7 @@
               <w:rPr>
                 <w:sz w:val="18"/>
               </w:rPr>
-              <w:t>+0.032 [+0.026, +0.037]</w:t>
+              <w:t>+0.091 [+0.082, +0.099]</w:t>
             </w:r>
           </w:p>
         </w:tc>
@@ -1927,7 +2007,7 @@
               <w:rPr>
                 <w:sz w:val="18"/>
               </w:rPr>
-              <w:t>+0.49 (medium)</w:t>
+              <w:t>+0.74 (large)</w:t>
             </w:r>
           </w:p>
         </w:tc>
@@ -1940,7 +2020,7 @@
               <w:rPr>
                 <w:sz w:val="18"/>
               </w:rPr>
-              <w:t>1.0e-24 ***</w:t>
+              <w:t>1.5e-56 ***</w:t>
             </w:r>
           </w:p>
         </w:tc>
@@ -1955,7 +2035,7 @@
               <w:rPr>
                 <w:sz w:val="18"/>
               </w:rPr>
-              <w:t>Hybrid — neither module</w:t>
+              <w:t>CLAHE-only (baseline)</w:t>
             </w:r>
           </w:p>
         </w:tc>
@@ -1981,7 +2061,7 @@
               <w:rPr>
                 <w:sz w:val="18"/>
               </w:rPr>
-              <w:t>+0.050 [+0.043, +0.057]</w:t>
+              <w:t>-0.069 [-0.080, -0.057]</w:t>
             </w:r>
           </w:p>
         </w:tc>
@@ -1994,7 +2074,7 @@
               <w:rPr>
                 <w:sz w:val="18"/>
               </w:rPr>
-              <w:t>+0.71 (large)</w:t>
+              <w:t>-0.55 (large)</w:t>
             </w:r>
           </w:p>
         </w:tc>
@@ -2007,7 +2087,7 @@
               <w:rPr>
                 <w:sz w:val="18"/>
               </w:rPr>
-              <w:t>3.5e-52 ***</w:t>
+              <w:t>3.4e-31 ***</w:t>
             </w:r>
           </w:p>
         </w:tc>
@@ -2022,7 +2102,7 @@
               <w:rPr>
                 <w:sz w:val="18"/>
               </w:rPr>
-              <w:t>Hybrid — neither module</w:t>
+              <w:t>CLAHE-only (baseline)</w:t>
             </w:r>
           </w:p>
         </w:tc>
@@ -2048,7 +2128,7 @@
               <w:rPr>
                 <w:sz w:val="18"/>
               </w:rPr>
-              <w:t>+0.003 [+0.002, +0.004]</w:t>
+              <w:t>-0.047 [-0.050, -0.044]</w:t>
             </w:r>
           </w:p>
         </w:tc>
@@ -2061,7 +2141,7 @@
               <w:rPr>
                 <w:sz w:val="18"/>
               </w:rPr>
-              <w:t>+0.43 (medium)</w:t>
+              <w:t>-0.91 (large)</w:t>
             </w:r>
           </w:p>
         </w:tc>
@@ -2074,7 +2154,7 @@
               <w:rPr>
                 <w:sz w:val="18"/>
               </w:rPr>
-              <w:t>2.1e-19 ***</w:t>
+              <w:t>6.8e-85 ***</w:t>
             </w:r>
           </w:p>
         </w:tc>
@@ -2089,7 +2169,7 @@
               <w:rPr>
                 <w:sz w:val="18"/>
               </w:rPr>
-              <w:t>Hybrid — neither module</w:t>
+              <w:t>CLAHE-only (baseline)</w:t>
             </w:r>
           </w:p>
         </w:tc>
@@ -2115,7 +2195,7 @@
               <w:rPr>
                 <w:sz w:val="18"/>
               </w:rPr>
-              <w:t>+0.030 [+0.024, +0.035]</w:t>
+              <w:t>-0.038 [-0.051, -0.026]</w:t>
             </w:r>
           </w:p>
         </w:tc>
@@ -2128,7 +2208,7 @@
               <w:rPr>
                 <w:sz w:val="18"/>
               </w:rPr>
-              <w:t>+0.67 (large)</w:t>
+              <w:t>-0.28 (small)</w:t>
             </w:r>
           </w:p>
         </w:tc>
@@ -2141,7 +2221,7 @@
               <w:rPr>
                 <w:sz w:val="18"/>
               </w:rPr>
-              <w:t>2.4e-46 ***</w:t>
+              <w:t>2.6e-08 ***</w:t>
             </w:r>
           </w:p>
         </w:tc>
@@ -2156,7 +2236,7 @@
               <w:rPr>
                 <w:sz w:val="18"/>
               </w:rPr>
-              <w:t>Hybrid — neither module</w:t>
+              <w:t>CLAHE-only (baseline)</w:t>
             </w:r>
           </w:p>
         </w:tc>
@@ -2182,7 +2262,7 @@
               <w:rPr>
                 <w:sz w:val="18"/>
               </w:rPr>
-              <w:t>+0.18 [+0.14, +0.24]</w:t>
+              <w:t>-0.04 [-0.30, +0.20]</w:t>
             </w:r>
           </w:p>
         </w:tc>
@@ -2195,7 +2275,7 @@
               <w:rPr>
                 <w:sz w:val="18"/>
               </w:rPr>
-              <w:t>+0.32 (medium)</w:t>
+              <w:t>+0.04 (negligible)</w:t>
             </w:r>
           </w:p>
         </w:tc>
@@ -2208,7 +2288,7 @@
               <w:rPr>
                 <w:sz w:val="18"/>
               </w:rPr>
-              <w:t>2.7e-11 ***</w:t>
+              <w:t>4.3e-01 ns</w:t>
             </w:r>
           </w:p>
         </w:tc>
@@ -2223,7 +2303,7 @@
               <w:rPr>
                 <w:sz w:val="18"/>
               </w:rPr>
-              <w:t>Hybrid — neither module</w:t>
+              <w:t>CLAHE-only (baseline)</w:t>
             </w:r>
           </w:p>
         </w:tc>
@@ -2249,7 +2329,7 @@
               <w:rPr>
                 <w:sz w:val="18"/>
               </w:rPr>
-              <w:t>+0.004 [+0.002, +0.006]</w:t>
+              <w:t>+0.032 [+0.026, +0.037]</w:t>
             </w:r>
           </w:p>
         </w:tc>
@@ -2262,7 +2342,7 @@
               <w:rPr>
                 <w:sz w:val="18"/>
               </w:rPr>
-              <w:t>+0.22 (small)</w:t>
+              <w:t>+0.49 (medium)</w:t>
             </w:r>
           </w:p>
         </w:tc>
@@ -2275,7 +2355,7 @@
               <w:rPr>
                 <w:sz w:val="18"/>
               </w:rPr>
-              <w:t>1.8e-05 ***</w:t>
+              <w:t>1.1e-24 ***</w:t>
             </w:r>
           </w:p>
         </w:tc>
@@ -2290,7 +2370,7 @@
               <w:rPr>
                 <w:sz w:val="18"/>
               </w:rPr>
-              <w:t>Hybrid — Module 7 only</w:t>
+              <w:t>Hybrid — neither module</w:t>
             </w:r>
           </w:p>
         </w:tc>
@@ -2316,7 +2396,7 @@
               <w:rPr>
                 <w:sz w:val="18"/>
               </w:rPr>
-              <w:t>+0.015 [+0.010, +0.021]</w:t>
+              <w:t>+0.050 [+0.043, +0.057]</w:t>
             </w:r>
           </w:p>
         </w:tc>
@@ -2329,7 +2409,7 @@
               <w:rPr>
                 <w:sz w:val="18"/>
               </w:rPr>
-              <w:t>+0.99 (large)</w:t>
+              <w:t>+0.71 (large)</w:t>
             </w:r>
           </w:p>
         </w:tc>
@@ -2342,7 +2422,7 @@
               <w:rPr>
                 <w:sz w:val="18"/>
               </w:rPr>
-              <w:t>2.5e-06 ***</w:t>
+              <w:t>4.1e-52 ***</w:t>
             </w:r>
           </w:p>
         </w:tc>
@@ -2357,7 +2437,7 @@
               <w:rPr>
                 <w:sz w:val="18"/>
               </w:rPr>
-              <w:t>Hybrid — Module 7 only</w:t>
+              <w:t>Hybrid — neither module</w:t>
             </w:r>
           </w:p>
         </w:tc>
@@ -2383,7 +2463,7 @@
               <w:rPr>
                 <w:sz w:val="18"/>
               </w:rPr>
-              <w:t>+0.002 [+0.001, +0.003]</w:t>
+              <w:t>+0.003 [+0.002, +0.004]</w:t>
             </w:r>
           </w:p>
         </w:tc>
@@ -2396,7 +2476,7 @@
               <w:rPr>
                 <w:sz w:val="18"/>
               </w:rPr>
-              <w:t>+1.00 (large)</w:t>
+              <w:t>+0.43 (medium)</w:t>
             </w:r>
           </w:p>
         </w:tc>
@@ -2409,7 +2489,7 @@
               <w:rPr>
                 <w:sz w:val="18"/>
               </w:rPr>
-              <w:t>2.5e-06 ***</w:t>
+              <w:t>2.2e-19 ***</w:t>
             </w:r>
           </w:p>
         </w:tc>
@@ -2424,7 +2504,7 @@
               <w:rPr>
                 <w:sz w:val="18"/>
               </w:rPr>
-              <w:t>Hybrid — Module 7 only</w:t>
+              <w:t>Hybrid — neither module</w:t>
             </w:r>
           </w:p>
         </w:tc>
@@ -2450,7 +2530,7 @@
               <w:rPr>
                 <w:sz w:val="18"/>
               </w:rPr>
-              <w:t>+0.014 [+0.010, +0.019]</w:t>
+              <w:t>+0.030 [+0.024, +0.035]</w:t>
             </w:r>
           </w:p>
         </w:tc>
@@ -2463,7 +2543,7 @@
               <w:rPr>
                 <w:sz w:val="18"/>
               </w:rPr>
-              <w:t>+1.00 (large)</w:t>
+              <w:t>+0.67 (large)</w:t>
             </w:r>
           </w:p>
         </w:tc>
@@ -2476,7 +2556,7 @@
               <w:rPr>
                 <w:sz w:val="18"/>
               </w:rPr>
-              <w:t>2.5e-06 ***</w:t>
+              <w:t>2.8e-46 ***</w:t>
             </w:r>
           </w:p>
         </w:tc>
@@ -2491,7 +2571,7 @@
               <w:rPr>
                 <w:sz w:val="18"/>
               </w:rPr>
-              <w:t>Hybrid — Module 7 only</w:t>
+              <w:t>Hybrid — neither module</w:t>
             </w:r>
           </w:p>
         </w:tc>
@@ -2517,7 +2597,7 @@
               <w:rPr>
                 <w:sz w:val="18"/>
               </w:rPr>
-              <w:t>+0.02 [-0.00, +0.05]</w:t>
+              <w:t>+0.18 [+0.14, +0.24]</w:t>
             </w:r>
           </w:p>
         </w:tc>
@@ -2530,7 +2610,7 @@
               <w:rPr>
                 <w:sz w:val="18"/>
               </w:rPr>
-              <w:t>+0.28 (small)</w:t>
+              <w:t>+0.32 (medium)</w:t>
             </w:r>
           </w:p>
         </w:tc>
@@ -2543,7 +2623,7 @@
               <w:rPr>
                 <w:sz w:val="18"/>
               </w:rPr>
-              <w:t>2.9e-01 ns</w:t>
+              <w:t>2.9e-11 ***</w:t>
             </w:r>
           </w:p>
         </w:tc>
@@ -2558,7 +2638,7 @@
               <w:rPr>
                 <w:sz w:val="18"/>
               </w:rPr>
-              <w:t>Hybrid — Module 7 only</w:t>
+              <w:t>Hybrid — neither module</w:t>
             </w:r>
           </w:p>
         </w:tc>
@@ -2584,7 +2664,7 @@
               <w:rPr>
                 <w:sz w:val="18"/>
               </w:rPr>
-              <w:t>+0.001 [-0.000, +0.003]</w:t>
+              <w:t>+0.004 [+0.002, +0.006]</w:t>
             </w:r>
           </w:p>
         </w:tc>
@@ -2597,7 +2677,7 @@
               <w:rPr>
                 <w:sz w:val="18"/>
               </w:rPr>
-              <w:t>+0.33 (medium)</w:t>
+              <w:t>+0.22 (small)</w:t>
             </w:r>
           </w:p>
         </w:tc>
@@ -2610,7 +2690,7 @@
               <w:rPr>
                 <w:sz w:val="18"/>
               </w:rPr>
-              <w:t>2.7e-01 ns</w:t>
+              <w:t>1.8e-05 ***</w:t>
             </w:r>
           </w:p>
         </w:tc>
@@ -2625,7 +2705,7 @@
               <w:rPr>
                 <w:sz w:val="18"/>
               </w:rPr>
-              <w:t>Hybrid — Module 5 only</w:t>
+              <w:t>Hybrid — Module 7 only</w:t>
             </w:r>
           </w:p>
         </w:tc>
@@ -2651,7 +2731,7 @@
               <w:rPr>
                 <w:sz w:val="18"/>
               </w:rPr>
-              <w:t>+0.038 [+0.034, +0.042]</w:t>
+              <w:t>+0.015 [+0.010, +0.021]</w:t>
             </w:r>
           </w:p>
         </w:tc>
@@ -2664,7 +2744,7 @@
               <w:rPr>
                 <w:sz w:val="18"/>
               </w:rPr>
-              <w:t>+0.70 (large)</w:t>
+              <w:t>+0.99 (large)</w:t>
             </w:r>
           </w:p>
         </w:tc>
@@ -2677,7 +2757,7 @@
               <w:rPr>
                 <w:sz w:val="18"/>
               </w:rPr>
-              <w:t>9.3e-51 ***</w:t>
+              <w:t>2.7e-06 ***</w:t>
             </w:r>
           </w:p>
         </w:tc>
@@ -2692,7 +2772,7 @@
               <w:rPr>
                 <w:sz w:val="18"/>
               </w:rPr>
-              <w:t>Hybrid — Module 5 only</w:t>
+              <w:t>Hybrid — Module 7 only</w:t>
             </w:r>
           </w:p>
         </w:tc>
@@ -2718,7 +2798,7 @@
               <w:rPr>
                 <w:sz w:val="18"/>
               </w:rPr>
-              <w:t>+0.001 [+0.001, +0.002]</w:t>
+              <w:t>+0.002 [+0.001, +0.003]</w:t>
             </w:r>
           </w:p>
         </w:tc>
@@ -2731,7 +2811,7 @@
               <w:rPr>
                 <w:sz w:val="18"/>
               </w:rPr>
-              <w:t>+0.41 (medium)</w:t>
+              <w:t>+1.00 (large)</w:t>
             </w:r>
           </w:p>
         </w:tc>
@@ -2744,7 +2824,7 @@
               <w:rPr>
                 <w:sz w:val="18"/>
               </w:rPr>
-              <w:t>8.4e-18 ***</w:t>
+              <w:t>2.7e-06 ***</w:t>
             </w:r>
           </w:p>
         </w:tc>
@@ -2759,7 +2839,7 @@
               <w:rPr>
                 <w:sz w:val="18"/>
               </w:rPr>
-              <w:t>Hybrid — Module 5 only</w:t>
+              <w:t>Hybrid — Module 7 only</w:t>
             </w:r>
           </w:p>
         </w:tc>
@@ -2785,7 +2865,7 @@
               <w:rPr>
                 <w:sz w:val="18"/>
               </w:rPr>
-              <w:t>+0.016 [+0.014, +0.018]</w:t>
+              <w:t>+0.014 [+0.010, +0.019]</w:t>
             </w:r>
           </w:p>
         </w:tc>
@@ -2798,7 +2878,7 @@
               <w:rPr>
                 <w:sz w:val="18"/>
               </w:rPr>
-              <w:t>+0.66 (large)</w:t>
+              <w:t>+1.00 (large)</w:t>
             </w:r>
           </w:p>
         </w:tc>
@@ -2811,7 +2891,7 @@
               <w:rPr>
                 <w:sz w:val="18"/>
               </w:rPr>
-              <w:t>6.3e-45 ***</w:t>
+              <w:t>2.7e-06 ***</w:t>
             </w:r>
           </w:p>
         </w:tc>
@@ -2826,7 +2906,7 @@
               <w:rPr>
                 <w:sz w:val="18"/>
               </w:rPr>
-              <w:t>Hybrid — Module 5 only</w:t>
+              <w:t>Hybrid — Module 7 only</w:t>
             </w:r>
           </w:p>
         </w:tc>
@@ -2852,7 +2932,7 @@
               <w:rPr>
                 <w:sz w:val="18"/>
               </w:rPr>
-              <w:t>+0.17 [+0.12, +0.21]</w:t>
+              <w:t>+0.02 [-0.00, +0.05]</w:t>
             </w:r>
           </w:p>
         </w:tc>
@@ -2865,7 +2945,7 @@
               <w:rPr>
                 <w:sz w:val="18"/>
               </w:rPr>
-              <w:t>+0.33 (medium)</w:t>
+              <w:t>+0.28 (small)</w:t>
             </w:r>
           </w:p>
         </w:tc>
@@ -2878,7 +2958,7 @@
               <w:rPr>
                 <w:sz w:val="18"/>
               </w:rPr>
-              <w:t>2.3e-11 ***</w:t>
+              <w:t>2.9e-01 ns</w:t>
             </w:r>
           </w:p>
         </w:tc>
@@ -2893,7 +2973,7 @@
               <w:rPr>
                 <w:sz w:val="18"/>
               </w:rPr>
-              <w:t>Hybrid — Module 5 only</w:t>
+              <w:t>Hybrid — Module 7 only</w:t>
             </w:r>
           </w:p>
         </w:tc>
@@ -2919,7 +2999,7 @@
               <w:rPr>
                 <w:sz w:val="18"/>
               </w:rPr>
-              <w:t>+0.003 [+0.002, +0.003]</w:t>
+              <w:t>+0.001 [-0.000, +0.003]</w:t>
             </w:r>
           </w:p>
         </w:tc>
@@ -2932,7 +3012,7 @@
               <w:rPr>
                 <w:sz w:val="18"/>
               </w:rPr>
-              <w:t>+0.23 (small)</w:t>
+              <w:t>+0.33 (medium)</w:t>
             </w:r>
           </w:p>
         </w:tc>
@@ -2945,7 +3025,7 @@
               <w:rPr>
                 <w:sz w:val="18"/>
               </w:rPr>
-              <w:t>6.2e-06 ***</w:t>
+              <w:t>2.7e-01 ns</w:t>
             </w:r>
           </w:p>
         </w:tc>
@@ -2960,7 +3040,7 @@
               <w:rPr>
                 <w:sz w:val="18"/>
               </w:rPr>
-              <w:t>Hybrid — original Module 7 (UCIQE+UIQM search)‡</w:t>
+              <w:t>Hybrid — Module 5 only</w:t>
             </w:r>
           </w:p>
         </w:tc>
@@ -2986,7 +3066,7 @@
               <w:rPr>
                 <w:sz w:val="18"/>
               </w:rPr>
-              <w:t>+0.012 [-0.001, +0.025]</w:t>
+              <w:t>+0.038 [+0.034, +0.042]</w:t>
             </w:r>
           </w:p>
         </w:tc>
@@ -2999,7 +3079,7 @@
               <w:rPr>
                 <w:sz w:val="18"/>
               </w:rPr>
-              <w:t>-0.09 (negligible)</w:t>
+              <w:t>+0.70 (large)</w:t>
             </w:r>
           </w:p>
         </w:tc>
@@ -3012,7 +3092,7 @@
               <w:rPr>
                 <w:sz w:val="18"/>
               </w:rPr>
-              <w:t>2.6e-01 ns</w:t>
+              <w:t>1.1e-50 ***</w:t>
             </w:r>
           </w:p>
         </w:tc>
@@ -3027,7 +3107,7 @@
               <w:rPr>
                 <w:sz w:val="18"/>
               </w:rPr>
-              <w:t>Hybrid — original Module 7 (UCIQE+UIQM search)‡</w:t>
+              <w:t>Hybrid — Module 5 only</w:t>
             </w:r>
           </w:p>
         </w:tc>
@@ -3053,7 +3133,7 @@
               <w:rPr>
                 <w:sz w:val="18"/>
               </w:rPr>
-              <w:t>-0.011 [-0.012, -0.010]</w:t>
+              <w:t>+0.001 [+0.001, +0.002]</w:t>
             </w:r>
           </w:p>
         </w:tc>
@@ -3066,7 +3146,7 @@
               <w:rPr>
                 <w:sz w:val="18"/>
               </w:rPr>
-              <w:t>-0.89 (large)</w:t>
+              <w:t>+0.41 (medium)</w:t>
             </w:r>
           </w:p>
         </w:tc>
@@ -3079,7 +3159,7 @@
               <w:rPr>
                 <w:sz w:val="18"/>
               </w:rPr>
-              <w:t>1.2e-80 ***</w:t>
+              <w:t>9.0e-18 ***</w:t>
             </w:r>
           </w:p>
         </w:tc>
@@ -3094,7 +3174,7 @@
               <w:rPr>
                 <w:sz w:val="18"/>
               </w:rPr>
-              <w:t>Hybrid — original Module 7 (UCIQE+UIQM search)‡</w:t>
+              <w:t>Hybrid — Module 5 only</w:t>
             </w:r>
           </w:p>
         </w:tc>
@@ -3120,7 +3200,7 @@
               <w:rPr>
                 <w:sz w:val="18"/>
               </w:rPr>
-              <w:t>-0.003 [-0.009, +0.003]</w:t>
+              <w:t>+0.016 [+0.014, +0.018]</w:t>
             </w:r>
           </w:p>
         </w:tc>
@@ -3133,7 +3213,7 @@
               <w:rPr>
                 <w:sz w:val="18"/>
               </w:rPr>
-              <w:t>-0.12 (small)</w:t>
+              <w:t>+0.66 (large)</w:t>
             </w:r>
           </w:p>
         </w:tc>
@@ -3146,7 +3226,7 @@
               <w:rPr>
                 <w:sz w:val="18"/>
               </w:rPr>
-              <w:t>4.7e-02 *</w:t>
+              <w:t>7.5e-45 ***</w:t>
             </w:r>
           </w:p>
         </w:tc>
@@ -3161,6 +3241,140 @@
               <w:rPr>
                 <w:sz w:val="18"/>
               </w:rPr>
+              <w:t>Hybrid — Module 5 only</w:t>
+            </w:r>
+          </w:p>
+        </w:tc>
+        <w:tc>
+          <w:tcPr>
+            <w:tcW w:type="dxa" w:w="1728"/>
+          </w:tcPr>
+          <w:p>
+            <w:r>
+              <w:rPr>
+                <w:sz w:val="18"/>
+              </w:rPr>
+              <w:t>PSNR (dB)</w:t>
+            </w:r>
+          </w:p>
+        </w:tc>
+        <w:tc>
+          <w:tcPr>
+            <w:tcW w:type="dxa" w:w="1728"/>
+          </w:tcPr>
+          <w:p>
+            <w:r>
+              <w:rPr>
+                <w:sz w:val="18"/>
+              </w:rPr>
+              <w:t>+0.17 [+0.12, +0.21]</w:t>
+            </w:r>
+          </w:p>
+        </w:tc>
+        <w:tc>
+          <w:tcPr>
+            <w:tcW w:type="dxa" w:w="1728"/>
+          </w:tcPr>
+          <w:p>
+            <w:r>
+              <w:rPr>
+                <w:sz w:val="18"/>
+              </w:rPr>
+              <w:t>+0.33 (medium)</w:t>
+            </w:r>
+          </w:p>
+        </w:tc>
+        <w:tc>
+          <w:tcPr>
+            <w:tcW w:type="dxa" w:w="1728"/>
+          </w:tcPr>
+          <w:p>
+            <w:r>
+              <w:rPr>
+                <w:sz w:val="18"/>
+              </w:rPr>
+              <w:t>2.5e-11 ***</w:t>
+            </w:r>
+          </w:p>
+        </w:tc>
+      </w:tr>
+      <w:tr>
+        <w:tc>
+          <w:tcPr>
+            <w:tcW w:type="dxa" w:w="1728"/>
+          </w:tcPr>
+          <w:p>
+            <w:r>
+              <w:rPr>
+                <w:sz w:val="18"/>
+              </w:rPr>
+              <w:t>Hybrid — Module 5 only</w:t>
+            </w:r>
+          </w:p>
+        </w:tc>
+        <w:tc>
+          <w:tcPr>
+            <w:tcW w:type="dxa" w:w="1728"/>
+          </w:tcPr>
+          <w:p>
+            <w:r>
+              <w:rPr>
+                <w:sz w:val="18"/>
+              </w:rPr>
+              <w:t>SSIM</w:t>
+            </w:r>
+          </w:p>
+        </w:tc>
+        <w:tc>
+          <w:tcPr>
+            <w:tcW w:type="dxa" w:w="1728"/>
+          </w:tcPr>
+          <w:p>
+            <w:r>
+              <w:rPr>
+                <w:sz w:val="18"/>
+              </w:rPr>
+              <w:t>+0.003 [+0.002, +0.003]</w:t>
+            </w:r>
+          </w:p>
+        </w:tc>
+        <w:tc>
+          <w:tcPr>
+            <w:tcW w:type="dxa" w:w="1728"/>
+          </w:tcPr>
+          <w:p>
+            <w:r>
+              <w:rPr>
+                <w:sz w:val="18"/>
+              </w:rPr>
+              <w:t>+0.23 (small)</w:t>
+            </w:r>
+          </w:p>
+        </w:tc>
+        <w:tc>
+          <w:tcPr>
+            <w:tcW w:type="dxa" w:w="1728"/>
+          </w:tcPr>
+          <w:p>
+            <w:r>
+              <w:rPr>
+                <w:sz w:val="18"/>
+              </w:rPr>
+              <w:t>6.2e-06 ***</w:t>
+            </w:r>
+          </w:p>
+        </w:tc>
+      </w:tr>
+      <w:tr>
+        <w:tc>
+          <w:tcPr>
+            <w:tcW w:type="dxa" w:w="1728"/>
+          </w:tcPr>
+          <w:p>
+            <w:r>
+              <w:rPr>
+                <w:sz w:val="18"/>
+              </w:rPr>
               <w:t>Hybrid — original Module 7 (UCIQE+UIQM search)‡</w:t>
             </w:r>
           </w:p>
@@ -3174,6 +3388,207 @@
               <w:rPr>
                 <w:sz w:val="18"/>
               </w:rPr>
+              <w:t>Entropy</w:t>
+            </w:r>
+          </w:p>
+        </w:tc>
+        <w:tc>
+          <w:tcPr>
+            <w:tcW w:type="dxa" w:w="1728"/>
+          </w:tcPr>
+          <w:p>
+            <w:r>
+              <w:rPr>
+                <w:sz w:val="18"/>
+              </w:rPr>
+              <w:t>+0.012 [-0.001, +0.025]</w:t>
+            </w:r>
+          </w:p>
+        </w:tc>
+        <w:tc>
+          <w:tcPr>
+            <w:tcW w:type="dxa" w:w="1728"/>
+          </w:tcPr>
+          <w:p>
+            <w:r>
+              <w:rPr>
+                <w:sz w:val="18"/>
+              </w:rPr>
+              <w:t>-0.09 (negligible)</w:t>
+            </w:r>
+          </w:p>
+        </w:tc>
+        <w:tc>
+          <w:tcPr>
+            <w:tcW w:type="dxa" w:w="1728"/>
+          </w:tcPr>
+          <w:p>
+            <w:r>
+              <w:rPr>
+                <w:sz w:val="18"/>
+              </w:rPr>
+              <w:t>2.6e-01 ns</w:t>
+            </w:r>
+          </w:p>
+        </w:tc>
+      </w:tr>
+      <w:tr>
+        <w:tc>
+          <w:tcPr>
+            <w:tcW w:type="dxa" w:w="1728"/>
+          </w:tcPr>
+          <w:p>
+            <w:r>
+              <w:rPr>
+                <w:sz w:val="18"/>
+              </w:rPr>
+              <w:t>Hybrid — original Module 7 (UCIQE+UIQM search)‡</w:t>
+            </w:r>
+          </w:p>
+        </w:tc>
+        <w:tc>
+          <w:tcPr>
+            <w:tcW w:type="dxa" w:w="1728"/>
+          </w:tcPr>
+          <w:p>
+            <w:r>
+              <w:rPr>
+                <w:sz w:val="18"/>
+              </w:rPr>
+              <w:t>UCIQE</w:t>
+            </w:r>
+          </w:p>
+        </w:tc>
+        <w:tc>
+          <w:tcPr>
+            <w:tcW w:type="dxa" w:w="1728"/>
+          </w:tcPr>
+          <w:p>
+            <w:r>
+              <w:rPr>
+                <w:sz w:val="18"/>
+              </w:rPr>
+              <w:t>-0.011 [-0.012, -0.010]</w:t>
+            </w:r>
+          </w:p>
+        </w:tc>
+        <w:tc>
+          <w:tcPr>
+            <w:tcW w:type="dxa" w:w="1728"/>
+          </w:tcPr>
+          <w:p>
+            <w:r>
+              <w:rPr>
+                <w:sz w:val="18"/>
+              </w:rPr>
+              <w:t>-0.89 (large)</w:t>
+            </w:r>
+          </w:p>
+        </w:tc>
+        <w:tc>
+          <w:tcPr>
+            <w:tcW w:type="dxa" w:w="1728"/>
+          </w:tcPr>
+          <w:p>
+            <w:r>
+              <w:rPr>
+                <w:sz w:val="18"/>
+              </w:rPr>
+              <w:t>1.4e-80 ***</w:t>
+            </w:r>
+          </w:p>
+        </w:tc>
+      </w:tr>
+      <w:tr>
+        <w:tc>
+          <w:tcPr>
+            <w:tcW w:type="dxa" w:w="1728"/>
+          </w:tcPr>
+          <w:p>
+            <w:r>
+              <w:rPr>
+                <w:sz w:val="18"/>
+              </w:rPr>
+              <w:t>Hybrid — original Module 7 (UCIQE+UIQM search)‡</w:t>
+            </w:r>
+          </w:p>
+        </w:tc>
+        <w:tc>
+          <w:tcPr>
+            <w:tcW w:type="dxa" w:w="1728"/>
+          </w:tcPr>
+          <w:p>
+            <w:r>
+              <w:rPr>
+                <w:sz w:val="18"/>
+              </w:rPr>
+              <w:t>UIQM</w:t>
+            </w:r>
+          </w:p>
+        </w:tc>
+        <w:tc>
+          <w:tcPr>
+            <w:tcW w:type="dxa" w:w="1728"/>
+          </w:tcPr>
+          <w:p>
+            <w:r>
+              <w:rPr>
+                <w:sz w:val="18"/>
+              </w:rPr>
+              <w:t>-0.003 [-0.009, +0.003]</w:t>
+            </w:r>
+          </w:p>
+        </w:tc>
+        <w:tc>
+          <w:tcPr>
+            <w:tcW w:type="dxa" w:w="1728"/>
+          </w:tcPr>
+          <w:p>
+            <w:r>
+              <w:rPr>
+                <w:sz w:val="18"/>
+              </w:rPr>
+              <w:t>-0.12 (small)</w:t>
+            </w:r>
+          </w:p>
+        </w:tc>
+        <w:tc>
+          <w:tcPr>
+            <w:tcW w:type="dxa" w:w="1728"/>
+          </w:tcPr>
+          <w:p>
+            <w:r>
+              <w:rPr>
+                <w:sz w:val="18"/>
+              </w:rPr>
+              <w:t>4.7e-02 *</w:t>
+            </w:r>
+          </w:p>
+        </w:tc>
+      </w:tr>
+      <w:tr>
+        <w:tc>
+          <w:tcPr>
+            <w:tcW w:type="dxa" w:w="1728"/>
+          </w:tcPr>
+          <w:p>
+            <w:r>
+              <w:rPr>
+                <w:sz w:val="18"/>
+              </w:rPr>
+              <w:t>Hybrid — original Module 7 (UCIQE+UIQM search)‡</w:t>
+            </w:r>
+          </w:p>
+        </w:tc>
+        <w:tc>
+          <w:tcPr>
+            <w:tcW w:type="dxa" w:w="1728"/>
+          </w:tcPr>
+          <w:p>
+            <w:r>
+              <w:rPr>
+                <w:sz w:val="18"/>
+              </w:rPr>
               <w:t>PSNR (dB)</w:t>
             </w:r>
           </w:p>
@@ -3213,7 +3628,7 @@
               <w:rPr>
                 <w:sz w:val="18"/>
               </w:rPr>
-              <w:t>4.8e-24 ***</w:t>
+              <w:t>5.1e-24 ***</w:t>
             </w:r>
           </w:p>
         </w:tc>
@@ -3332,8 +3747,16 @@
       </w:r>
     </w:p>
     <w:p>
+      <w:pPr>
+        <w:pStyle w:val="ListBullet"/>
+      </w:pPr>
       <w:r>
-        <w:t>PSNR/SSIM against the UIEB references. On the test split, hybrid PSNR = 18.27 dB and SSIM = 0.871, against CLAHE-only 18.32 dB / 0.840, conventional HE 16.36 dB / 0.781, and UDCP 12.99 dB / 0.656. The UIEB references are not ground-truth clear-water images. Li et al. (2019) produced each one by having volunteers choose the preferred output among 12 existing enhancement methods. PSNR/SSIM therefore measure closeness to the output volunteers preferred, which is usually a moderate correction. Against CLAHE-only, the strongest baseline, the hybrid is level on PSNR (Δ -0.04 dB, negligible, not significant) and higher on SSIM (Δ +0.032, medium effect). CLAHE-only is a gentle local operator that stays close to moderate references; the hybrid additionally dehazes and re-balances colour, which improves structural similarity but can shift global intensity, the quantity PSNR penalizes most.</w:t>
+        <w:t>Gray-world WB + CLAHE (baseline) — higher: PSNR Δ=+0.341 (r=+0.24, small); SSIM Δ=+0.033 (r=+0.59, large). Lower: entropy Δ=-0.077 (r=-0.61, large); UCIQE Δ=-0.019 (r=-0.64, large); UIQM Δ=-0.161 (r=-0.74, large).</w:t>
+      </w:r>
+    </w:p>
+    <w:p>
+      <w:r>
+        <w:t>PSNR/SSIM against the UIEB references. On the test split, hybrid PSNR = 18.27 dB and SSIM = 0.871, against CLAHE-only 18.32 dB / 0.840, gray-world WB + CLAHE 17.93 dB / 0.838, conventional HE 16.36 dB / 0.781, and UDCP 12.99 dB / 0.656. The UIEB references are not ground-truth clear-water images. Li et al. (2019) produced each one by having volunteers choose the preferred output among 12 existing enhancement methods. PSNR/SSIM therefore measure closeness to the output volunteers preferred, which is usually a moderate correction. Against CLAHE-only, the strongest baseline, the hybrid is level on PSNR (Δ -0.04 dB, negligible, not significant) and higher on SSIM (Δ +0.032, medium effect). CLAHE-only is a gentle local operator that stays close to moderate references; the hybrid additionally dehazes and re-balances colour, which improves structural similarity but can shift global intensity, the quantity PSNR penalizes most.</w:t>
       </w:r>
     </w:p>
     <w:p>
@@ -5724,6 +6147,86 @@
                 <w:sz w:val="18"/>
               </w:rPr>
               <w:t>0.840 ± 0.080</w:t>
+            </w:r>
+          </w:p>
+        </w:tc>
+      </w:tr>
+      <w:tr>
+        <w:tc>
+          <w:tcPr>
+            <w:tcW w:type="dxa" w:w="1440"/>
+          </w:tcPr>
+          <w:p>
+            <w:r>
+              <w:rPr>
+                <w:sz w:val="18"/>
+              </w:rPr>
+              <w:t>2b. Gray-world WB + CLAHE baseline (common practitioner recipe)</w:t>
+            </w:r>
+          </w:p>
+        </w:tc>
+        <w:tc>
+          <w:tcPr>
+            <w:tcW w:type="dxa" w:w="1440"/>
+          </w:tcPr>
+          <w:p>
+            <w:r>
+              <w:rPr>
+                <w:sz w:val="18"/>
+              </w:rPr>
+              <w:t>7.313 ± 0.414</w:t>
+            </w:r>
+          </w:p>
+        </w:tc>
+        <w:tc>
+          <w:tcPr>
+            <w:tcW w:type="dxa" w:w="1440"/>
+          </w:tcPr>
+          <w:p>
+            <w:r>
+              <w:rPr>
+                <w:sz w:val="18"/>
+              </w:rPr>
+              <w:t>0.331 ± 0.069</w:t>
+            </w:r>
+          </w:p>
+        </w:tc>
+        <w:tc>
+          <w:tcPr>
+            <w:tcW w:type="dxa" w:w="1440"/>
+          </w:tcPr>
+          <w:p>
+            <w:r>
+              <w:rPr>
+                <w:sz w:val="18"/>
+              </w:rPr>
+              <w:t>2.297 ± 0.558</w:t>
+            </w:r>
+          </w:p>
+        </w:tc>
+        <w:tc>
+          <w:tcPr>
+            <w:tcW w:type="dxa" w:w="1440"/>
+          </w:tcPr>
+          <w:p>
+            <w:r>
+              <w:rPr>
+                <w:sz w:val="18"/>
+              </w:rPr>
+              <w:t>17.93 ± 3.42</w:t>
+            </w:r>
+          </w:p>
+        </w:tc>
+        <w:tc>
+          <w:tcPr>
+            <w:tcW w:type="dxa" w:w="1440"/>
+          </w:tcPr>
+          <w:p>
+            <w:r>
+              <w:rPr>
+                <w:sz w:val="18"/>
+              </w:rPr>
+              <w:t>0.838 ± 0.079</w:t>
             </w:r>
           </w:p>
         </w:tc>

</xml_diff>